<commit_message>
numeric functions and string functions
</commit_message>
<xml_diff>
--- a/Day-11.docx
+++ b/Day-11.docx
@@ -8743,7 +8743,7 @@
   <w:style w:type="paragraph" w:default="1" w:styleId="Normal">
     <w:name w:val="Normal"/>
     <w:qFormat/>
-    <w:rsid w:val="007056C0"/>
+    <w:rsid w:val="0034736C"/>
   </w:style>
   <w:style w:type="character" w:default="1" w:styleId="DefaultParagraphFont">
     <w:name w:val="Default Paragraph Font"/>
@@ -8779,7 +8779,7 @@
     <w:uiPriority w:val="99"/>
     <w:semiHidden/>
     <w:unhideWhenUsed/>
-    <w:rsid w:val="001C799A"/>
+    <w:rsid w:val="00FE3406"/>
     <w:pPr>
       <w:spacing w:before="100" w:beforeAutospacing="1" w:after="100" w:afterAutospacing="1" w:line="240" w:lineRule="auto"/>
     </w:pPr>
@@ -8792,7 +8792,7 @@
   <w:style w:type="character" w:customStyle="1" w:styleId="apple-tab-span">
     <w:name w:val="apple-tab-span"/>
     <w:basedOn w:val="DefaultParagraphFont"/>
-    <w:rsid w:val="001C799A"/>
+    <w:rsid w:val="00FE3406"/>
   </w:style>
 </w:styles>
 </file>

</xml_diff>